<commit_message>
Replace Python generator with minimal Java two-note generator
The melody now uses only two pitches, a low C and a high C, alternating
with a 0.25 chance of repeating instead of swapping, so every level gets
a different pattern. A bass drum marks each beat.

Difficulty is the single input from the game and sets the tempo, from
80 bpm on level 1 to 200 bpm on level 5. The same 32-note pattern
therefore lasts 24.0 s on the easiest level and 9.6 s on the hardest.

Written as one Java class with no external dependencies: javax.sound.midi
writes the MIDI files and java.awt draws the pattern figure.

Report and code documentation rewritten to match.
</commit_message>
<xml_diff>
--- a/Code_Documentation.docx
+++ b/Code_Documentation.docx
@@ -1,6 +1,6 @@
 
 <file path=word/document.xml><?xml version="1.0" encoding="utf-8"?>
-<w:document xmlns:wpc="http://schemas.microsoft.com/office/word/2010/wordprocessingCanvas" xmlns:mc="http://schemas.openxmlformats.org/markup-compatibility/2006" xmlns:o="urn:schemas-microsoft-com:office:office" xmlns:r="http://schemas.openxmlformats.org/officeDocument/2006/relationships" xmlns:m="http://schemas.openxmlformats.org/officeDocument/2006/math" xmlns:v="urn:schemas-microsoft-com:vml" xmlns:wp14="http://schemas.microsoft.com/office/word/2010/wordprocessingDrawing" xmlns:wp="http://schemas.openxmlformats.org/drawingml/2006/wordprocessingDrawing" xmlns:w10="urn:schemas-microsoft-com:office:word" xmlns:w="http://schemas.openxmlformats.org/wordprocessingml/2006/main" xmlns:w14="http://schemas.microsoft.com/office/word/2010/wordml" xmlns:w15="http://schemas.microsoft.com/office/word/2012/wordml" xmlns:wpg="http://schemas.microsoft.com/office/word/2010/wordprocessingGroup" xmlns:wpi="http://schemas.microsoft.com/office/word/2010/wordprocessingInk" xmlns:wne="http://schemas.microsoft.com/office/word/2006/wordml" xmlns:wps="http://schemas.microsoft.com/office/word/2010/wordprocessingShape" xmlns:cx="http://schemas.microsoft.com/office/drawing/2014/chartex" xmlns:cx1="http://schemas.microsoft.com/office/drawing/2015/9/8/chartex" xmlns:cx2="http://schemas.microsoft.com/office/drawing/2015/10/21/chartex" xmlns:cx3="http://schemas.microsoft.com/office/drawing/2016/5/9/chartex" xmlns:cx4="http://schemas.microsoft.com/office/drawing/2016/5/10/chartex" xmlns:cx5="http://schemas.microsoft.com/office/drawing/2016/5/11/chartex" xmlns:cx6="http://schemas.microsoft.com/office/drawing/2016/5/12/chartex" xmlns:cx7="http://schemas.microsoft.com/office/drawing/2016/5/13/chartex" xmlns:cx8="http://schemas.microsoft.com/office/drawing/2016/5/14/chartex" xmlns:aink="http://schemas.microsoft.com/office/drawing/2016/ink" xmlns:am3d="http://schemas.microsoft.com/office/drawing/2017/model3d" xmlns:w16cex="http://schemas.microsoft.com/office/word/2018/wordml/cex" xmlns:w16cid="http://schemas.microsoft.com/office/word/2016/wordml/cid" xmlns:w16="http://schemas.microsoft.com/office/word/2018/wordml" xmlns:w16sdtdh="http://schemas.microsoft.com/office/word/2020/wordml/sdtdatahash" xmlns:w16se="http://schemas.microsoft.com/office/word/2015/wordml/symex" mc:Ignorable="w14 w15 wp14">
+<w:document xmlns:wpc="http://schemas.microsoft.com/office/word/2010/wordprocessingCanvas" xmlns:mc="http://schemas.openxmlformats.org/markup-compatibility/2006" xmlns:o="urn:schemas-microsoft-com:office:office" xmlns:r="http://schemas.openxmlformats.org/officeDocument/2006/relationships" xmlns:m="http://schemas.openxmlformats.org/officeDocument/2006/math" xmlns:v="urn:schemas-microsoft-com:vml" xmlns:wp14="http://schemas.microsoft.com/office/word/2010/wordprocessingDrawing" xmlns:wp="http://schemas.openxmlformats.org/drawingml/2006/wordprocessingDrawing" xmlns:w10="urn:schemas-microsoft-com:office:word" xmlns:w="http://schemas.openxmlformats.org/wordprocessingml/2006/main" xmlns:w14="http://schemas.microsoft.com/office/word/2010/wordml" xmlns:w15="http://schemas.microsoft.com/office/word/2012/wordml" xmlns:wpg="http://schemas.microsoft.com/office/word/2010/wordprocessingGroup" xmlns:wpi="http://schemas.microsoft.com/office/word/2010/wordprocessingInk" xmlns:wne="http://schemas.microsoft.com/office/word/2006/wordml" xmlns:wps="http://schemas.microsoft.com/office/word/2010/wordprocessingShape" xmlns:cx="http://schemas.microsoft.com/office/drawing/2014/chartex" xmlns:cx1="http://schemas.microsoft.com/office/drawing/2015/9/8/chartex" xmlns:cx2="http://schemas.microsoft.com/office/drawing/2015/10/21/chartex" xmlns:cx3="http://schemas.microsoft.com/office/drawing/2016/5/9/chartex" xmlns:cx4="http://schemas.microsoft.com/office/drawing/2016/5/10/chartex" xmlns:cx5="http://schemas.microsoft.com/office/drawing/2016/5/11/chartex" xmlns:cx6="http://schemas.microsoft.com/office/drawing/2016/5/12/chartex" xmlns:cx7="http://schemas.microsoft.com/office/drawing/2016/5/13/chartex" xmlns:cx8="http://schemas.microsoft.com/office/drawing/2016/5/14/chartex" xmlns:aink="http://schemas.microsoft.com/office/drawing/2016/ink" xmlns:am3d="http://schemas.microsoft.com/office/drawing/2017/model3d" xmlns:w16cex="http://schemas.microsoft.com/office/word/2018/wordml/cex" xmlns:w16cid="http://schemas.microsoft.com/office/word/2016/wordml/cid" xmlns:w16="http://schemas.microsoft.com/office/word/2018/wordml" xmlns:w16sdtdh="http://schemas.microsoft.com/office/word/2020/wordml/sdtdatahash" xmlns:w16se="http://schemas.microsoft.com/office/word/2015/wordml/symex" xmlns:ns1="http://schemas.openxmlformats.org/markup-compatibility/2006" xmlns:ns2="http://schemas.openxmlformats.org/drawingml/2006/wordprocessingDrawing" xmlns:ns3="http://schemas.openxmlformats.org/drawingml/2006/main" xmlns:ns4="http://schemas.openxmlformats.org/drawingml/2006/picture" xmlns:ns5="http://schemas.openxmlformats.org/officeDocument/2006/relationships" xmlns:a="http://schemas.openxmlformats.org/drawingml/2006/main" xmlns:pic="http://schemas.openxmlformats.org/drawingml/2006/picture" mc:Ignorable="w14 w15 wp14">
   <w:body>
     <w:p>
       <w:pPr>
@@ -15,7 +15,7 @@
           <w:sz w:val="32"/>
           <w:szCs w:val="32"/>
         </w:rPr>
-        <w:t xml:space="preserve">Code Documentation: Procedural Music Generator</w:t>
+        <w:t xml:space="preserve">Code Documentation: Two-Note Procedural Music Generator</w:t>
       </w:r>
     </w:p>
     <w:p>
@@ -54,19 +54,11 @@
       </w:pPr>
       <w:r>
         <w:rPr>
-          <w:rFonts w:ascii="Courier New" w:cs="Courier New" w:eastAsia="Courier New" w:hAnsi="Courier New"/>
-          <w:sz w:val="21"/>
-          <w:szCs w:val="21"/>
-        </w:rPr>
-        <w:t xml:space="preserve">music_project.py</w:t>
-      </w:r>
-      <w:r>
-        <w:rPr>
-          <w:rFonts w:ascii="Times New Roman" w:cs="Times New Roman" w:eastAsia="Times New Roman" w:hAnsi="Times New Roman"/>
-          <w:sz w:val="24"/>
-          <w:szCs w:val="24"/>
-        </w:rPr>
-        <w:t xml:space="preserve"> makes short pieces of background music using simple rules (no AI) and saves them as MIDI files. It builds the music in four versions, each adding one rule (A: random, B: C major scale, C: weighted walk and rhythm rules, D: chords and bass), measures what each rule changes, and checks it like a PCG system: is it fast, does it follow its rules, does it give variety, and can a designer control it.</w:t>
+          <w:rFonts w:ascii="Times New Roman" w:cs="Times New Roman" w:eastAsia="Times New Roman" w:hAnsi="Times New Roman"/>
+          <w:sz w:val="24"/>
+          <w:szCs w:val="24"/>
+        </w:rPr>
+        <w:t xml:space="preserve">MusicGenerator.java writes background music for game levels. The melody uses only two pitches, a low C and a high C, and mostly alternates between them. A random repeat is allowed on each beat, so every level gets a different pattern. A bass drum marks every beat. The one thing the game controls is the difficulty level, which sets the tempo: the harder the level, the faster the music. The program writes one MIDI file per level plus one picture of the patterns.</w:t>
       </w:r>
     </w:p>
     <w:p>
@@ -95,7 +87,7 @@
           <w:sz w:val="24"/>
           <w:szCs w:val="24"/>
         </w:rPr>
-        <w:t xml:space="preserve">Install the libraries once:</w:t>
+        <w:t xml:space="preserve">Compile it once:</w:t>
       </w:r>
     </w:p>
     <w:p>
@@ -109,7 +101,7 @@
           <w:sz w:val="21"/>
           <w:szCs w:val="21"/>
         </w:rPr>
-        <w:t xml:space="preserve">pip3 install numpy matplotlib midiutil</w:t>
+        <w:t xml:space="preserve">javac MusicGenerator.java</w:t>
       </w:r>
     </w:p>
     <w:p>
@@ -136,7 +128,7 @@
           <w:sz w:val="21"/>
           <w:szCs w:val="21"/>
         </w:rPr>
-        <w:t xml:space="preserve">python3 music_project.py</w:t>
+        <w:t xml:space="preserve">java MusicGenerator</w:t>
       </w:r>
     </w:p>
     <w:p>
@@ -149,71 +141,7 @@
           <w:sz w:val="24"/>
           <w:szCs w:val="24"/>
         </w:rPr>
-        <w:t xml:space="preserve">It takes a few seconds. The results go into a </w:t>
-      </w:r>
-      <w:r>
-        <w:rPr>
-          <w:rFonts w:ascii="Courier New" w:cs="Courier New" w:eastAsia="Courier New" w:hAnsi="Courier New"/>
-          <w:sz w:val="21"/>
-          <w:szCs w:val="21"/>
-        </w:rPr>
-        <w:t xml:space="preserve">results</w:t>
-      </w:r>
-      <w:r>
-        <w:rPr>
-          <w:rFonts w:ascii="Times New Roman" w:cs="Times New Roman" w:eastAsia="Times New Roman" w:hAnsi="Times New Roman"/>
-          <w:sz w:val="24"/>
-          <w:szCs w:val="24"/>
-        </w:rPr>
-        <w:t xml:space="preserve"> folder: the MIDI files in </w:t>
-      </w:r>
-      <w:r>
-        <w:rPr>
-          <w:rFonts w:ascii="Courier New" w:cs="Courier New" w:eastAsia="Courier New" w:hAnsi="Courier New"/>
-          <w:sz w:val="21"/>
-          <w:szCs w:val="21"/>
-        </w:rPr>
-        <w:t xml:space="preserve">midi/</w:t>
-      </w:r>
-      <w:r>
-        <w:rPr>
-          <w:rFonts w:ascii="Times New Roman" w:cs="Times New Roman" w:eastAsia="Times New Roman" w:hAnsi="Times New Roman"/>
-          <w:sz w:val="24"/>
-          <w:szCs w:val="24"/>
-        </w:rPr>
-        <w:t xml:space="preserve">, the note lists in </w:t>
-      </w:r>
-      <w:r>
-        <w:rPr>
-          <w:rFonts w:ascii="Courier New" w:cs="Courier New" w:eastAsia="Courier New" w:hAnsi="Courier New"/>
-          <w:sz w:val="21"/>
-          <w:szCs w:val="21"/>
-        </w:rPr>
-        <w:t xml:space="preserve">notes/</w:t>
-      </w:r>
-      <w:r>
-        <w:rPr>
-          <w:rFonts w:ascii="Times New Roman" w:cs="Times New Roman" w:eastAsia="Times New Roman" w:hAnsi="Times New Roman"/>
-          <w:sz w:val="24"/>
-          <w:szCs w:val="24"/>
-        </w:rPr>
-        <w:t xml:space="preserve">, two piano-roll figures and </w:t>
-      </w:r>
-      <w:r>
-        <w:rPr>
-          <w:rFonts w:ascii="Courier New" w:cs="Courier New" w:eastAsia="Courier New" w:hAnsi="Courier New"/>
-          <w:sz w:val="21"/>
-          <w:szCs w:val="21"/>
-        </w:rPr>
-        <w:t xml:space="preserve">summary.txt</w:t>
-      </w:r>
-      <w:r>
-        <w:rPr>
-          <w:rFonts w:ascii="Times New Roman" w:cs="Times New Roman" w:eastAsia="Times New Roman" w:hAnsi="Times New Roman"/>
-          <w:sz w:val="24"/>
-          <w:szCs w:val="24"/>
-        </w:rPr>
-        <w:t xml:space="preserve">. Each piece uses a fixed seed, so the output is the same every time.</w:t>
+        <w:t xml:space="preserve">It finishes in under a second and writes everything into an output folder: level1.mid to level5.mid and patterns.png. There is nothing to install, because the MIDI writing and the drawing both use classes that come with Java.</w:t>
       </w:r>
     </w:p>
     <w:p>
@@ -242,7 +170,7 @@
           <w:sz w:val="24"/>
           <w:szCs w:val="24"/>
         </w:rPr>
-        <w:t xml:space="preserve">A note is stored as (pitch, start beat, length in beats), where the pitch is a MIDI number such as 60 for middle C. Every piece is 8 bars of 4/4. The full version builds a piece in three layers:</w:t>
+        <w:t xml:space="preserve">A piece is an array of thirty-two MIDI note numbers, one per beat. The generator starts on the low C and walks through the beats. On each beat it normally swaps to the other pitch, which gives the alternation low, high, low, high. With a probability of 0.25 it keeps the current pitch instead, which shifts the pattern and is what makes each level different. The level number seeds the random number generator, so a level always gets the same music.</w:t>
       </w:r>
     </w:p>
     <w:p>
@@ -252,42 +180,42 @@
       </w:pPr>
       <w:r>
         <w:drawing>
-          <wp:inline distT="0" distB="0" distL="0" distR="0">
-            <wp:extent cx="5715000" cy="1762125"/>
-            <wp:effectExtent t="0" r="0" b="0" l="0"/>
-            <wp:docPr id="1" name="" descr="" title=""/>
-            <wp:cNvGraphicFramePr>
-              <a:graphicFrameLocks xmlns:a="http://schemas.openxmlformats.org/drawingml/2006/main" noChangeAspect="1"/>
-            </wp:cNvGraphicFramePr>
-            <a:graphic xmlns:a="http://schemas.openxmlformats.org/drawingml/2006/main">
-              <a:graphicData uri="http://schemas.openxmlformats.org/drawingml/2006/picture">
-                <pic:pic xmlns:pic="http://schemas.openxmlformats.org/drawingml/2006/picture">
-                  <pic:nvPicPr>
-                    <pic:cNvPr id="0" name="" descr=""/>
-                    <pic:cNvPicPr>
-                      <a:picLocks noChangeAspect="1" noChangeArrowheads="1"/>
-                    </pic:cNvPicPr>
-                  </pic:nvPicPr>
-                  <pic:blipFill>
-                    <a:blip r:embed="rId7" cstate="none"/>
-                    <a:srcRect/>
-                    <a:stretch>
-                      <a:fillRect/>
-                    </a:stretch>
-                  </pic:blipFill>
-                  <pic:spPr bwMode="auto">
-                    <a:xfrm>
-                      <a:off x="0" y="0"/>
-                      <a:ext cx="5715000" cy="1762125"/>
-                    </a:xfrm>
-                    <a:prstGeom prst="rect">
-                      <a:avLst/>
-                    </a:prstGeom>
-                  </pic:spPr>
-                </pic:pic>
-              </a:graphicData>
-            </a:graphic>
-          </wp:inline>
+          <ns2:inline distT="0" distB="0" distL="0" distR="0">
+            <ns2:extent cx="5715000" cy="2761450"/>
+            <ns2:effectExtent t="0" r="0" b="0" l="0"/>
+            <ns2:docPr id="1" name="" descr="" title=""/>
+            <ns2:cNvGraphicFramePr>
+              <ns3:graphicFrameLocks noChangeAspect="1"/>
+            </ns2:cNvGraphicFramePr>
+            <ns3:graphic>
+              <ns3:graphicData uri="http://schemas.openxmlformats.org/drawingml/2006/picture">
+                <ns4:pic>
+                  <ns4:nvPicPr>
+                    <ns4:cNvPr id="0" name="" descr=""/>
+                    <ns4:cNvPicPr>
+                      <ns3:picLocks noChangeAspect="1" noChangeArrowheads="1"/>
+                    </ns4:cNvPicPr>
+                  </ns4:nvPicPr>
+                  <ns4:blipFill>
+                    <ns3:blip ns5:embed="rId7" cstate="none"/>
+                    <ns3:srcRect/>
+                    <ns3:stretch>
+                      <ns3:fillRect/>
+                    </ns3:stretch>
+                  </ns4:blipFill>
+                  <ns4:spPr bwMode="auto">
+                    <ns3:xfrm>
+                      <ns3:off x="0" y="0"/>
+                      <ns3:ext cx="5715000" cy="2761450"/>
+                    </ns3:xfrm>
+                    <ns3:prstGeom prst="rect">
+                      <ns3:avLst/>
+                    </ns3:prstGeom>
+                  </ns4:spPr>
+                </ns4:pic>
+              </ns3:graphicData>
+            </ns3:graphic>
+          </ns2:inline>
         </w:drawing>
       </w:r>
     </w:p>
@@ -304,109 +232,61 @@
           <w:sz w:val="20"/>
           <w:szCs w:val="20"/>
         </w:rPr>
-        <w:t xml:space="preserve">Fig. 1. The three layers of the generator</w:t>
-      </w:r>
-    </w:p>
-    <w:p>
-      <w:pPr>
-        <w:pStyle w:val="ListParagraph"/>
-        <w:numPr>
-          <w:ilvl w:val="0"/>
-          <w:numId w:val="2"/>
-        </w:numPr>
-        <w:spacing w:after="80"/>
-      </w:pPr>
-      <w:r>
-        <w:rPr>
-          <w:rFonts w:ascii="Times New Roman" w:cs="Times New Roman" w:eastAsia="Times New Roman" w:hAnsi="Times New Roman"/>
-          <w:sz w:val="24"/>
-          <w:szCs w:val="24"/>
-        </w:rPr>
-        <w:t xml:space="preserve">Rhythm: </w:t>
-      </w:r>
-      <w:r>
-        <w:rPr>
-          <w:rFonts w:ascii="Courier New" w:cs="Courier New" w:eastAsia="Courier New" w:hAnsi="Courier New"/>
-          <w:sz w:val="21"/>
-          <w:szCs w:val="21"/>
-        </w:rPr>
-        <w:t xml:space="preserve">ruled_rhythm</w:t>
-      </w:r>
-      <w:r>
-        <w:rPr>
-          <w:rFonts w:ascii="Times New Roman" w:cs="Times New Roman" w:eastAsia="Times New Roman" w:hAnsi="Times New Roman"/>
-          <w:sz w:val="24"/>
-          <w:szCs w:val="24"/>
-        </w:rPr>
-        <w:t xml:space="preserve"> picks eighth, quarter and half notes with weights 3, 5 and 2, and only picks lengths that still fit in the bar.</w:t>
-      </w:r>
-    </w:p>
-    <w:p>
-      <w:pPr>
-        <w:pStyle w:val="ListParagraph"/>
-        <w:numPr>
-          <w:ilvl w:val="0"/>
-          <w:numId w:val="2"/>
-        </w:numPr>
-        <w:spacing w:after="80"/>
-      </w:pPr>
-      <w:r>
-        <w:rPr>
-          <w:rFonts w:ascii="Times New Roman" w:cs="Times New Roman" w:eastAsia="Times New Roman" w:hAnsi="Times New Roman"/>
-          <w:sz w:val="24"/>
-          <w:szCs w:val="24"/>
-        </w:rPr>
-        <w:t xml:space="preserve">Melody: </w:t>
-      </w:r>
-      <w:r>
-        <w:rPr>
-          <w:rFonts w:ascii="Courier New" w:cs="Courier New" w:eastAsia="Courier New" w:hAnsi="Courier New"/>
-          <w:sz w:val="21"/>
-          <w:szCs w:val="21"/>
-        </w:rPr>
-        <w:t xml:space="preserve">walk</w:t>
-      </w:r>
-      <w:r>
-        <w:rPr>
-          <w:rFonts w:ascii="Times New Roman" w:cs="Times New Roman" w:eastAsia="Times New Roman" w:hAnsi="Times New Roman"/>
-          <w:sz w:val="24"/>
-          <w:szCs w:val="24"/>
-        </w:rPr>
-        <w:t xml:space="preserve"> moves along the C major scale. A move of one step is 6 times as likely as a jump of four steps, so the tune mostly moves to nearby notes. The last note becomes the closest C.</w:t>
-      </w:r>
-    </w:p>
-    <w:p>
-      <w:pPr>
-        <w:pStyle w:val="ListParagraph"/>
-        <w:numPr>
-          <w:ilvl w:val="0"/>
-          <w:numId w:val="2"/>
-        </w:numPr>
-        <w:spacing w:after="80"/>
-      </w:pPr>
-      <w:r>
-        <w:rPr>
-          <w:rFonts w:ascii="Times New Roman" w:cs="Times New Roman" w:eastAsia="Times New Roman" w:hAnsi="Times New Roman"/>
-          <w:sz w:val="24"/>
-          <w:szCs w:val="24"/>
-        </w:rPr>
-        <w:t xml:space="preserve">Harmony: </w:t>
-      </w:r>
-      <w:r>
-        <w:rPr>
-          <w:rFonts w:ascii="Courier New" w:cs="Courier New" w:eastAsia="Courier New" w:hAnsi="Courier New"/>
-          <w:sz w:val="21"/>
-          <w:szCs w:val="21"/>
-        </w:rPr>
-        <w:t xml:space="preserve">version_d</w:t>
-      </w:r>
-      <w:r>
-        <w:rPr>
-          <w:rFonts w:ascii="Times New Roman" w:cs="Times New Roman" w:eastAsia="Times New Roman" w:hAnsi="Times New Roman"/>
-          <w:sz w:val="24"/>
-          <w:szCs w:val="24"/>
-        </w:rPr>
-        <w:t xml:space="preserve"> adds a bass note per bar (C, Am, F, G, ending G then C), and the first melody note of each bar has to be a note of that bar's chord.</w:t>
+        <w:t xml:space="preserve">Fig. 1. The pattern the code produces for each level. Upper blocks are the high C, lower blocks are the low C.</w:t>
+      </w:r>
+    </w:p>
+    <w:p>
+      <w:pPr>
+        <w:pStyle w:val="ListParagraph"/>
+        <w:numPr>
+          <w:ilvl w:val="0"/>
+          <w:numId w:val="2"/>
+        </w:numPr>
+        <w:spacing w:after="80"/>
+      </w:pPr>
+      <w:r>
+        <w:rPr>
+          <w:rFonts w:ascii="Times New Roman" w:cs="Times New Roman" w:eastAsia="Times New Roman" w:hAnsi="Times New Roman"/>
+          <w:sz w:val="24"/>
+          <w:szCs w:val="24"/>
+        </w:rPr>
+        <w:t xml:space="preserve">Two pitches: LOW_NOTE is MIDI 60 and HIGH_NOTE is MIDI 72, the same note one octave apart, so they always sound right together.</w:t>
+      </w:r>
+    </w:p>
+    <w:p>
+      <w:pPr>
+        <w:pStyle w:val="ListParagraph"/>
+        <w:numPr>
+          <w:ilvl w:val="0"/>
+          <w:numId w:val="2"/>
+        </w:numPr>
+        <w:spacing w:after="80"/>
+      </w:pPr>
+      <w:r>
+        <w:rPr>
+          <w:rFonts w:ascii="Times New Roman" w:cs="Times New Roman" w:eastAsia="Times New Roman" w:hAnsi="Times New Roman"/>
+          <w:sz w:val="24"/>
+          <w:szCs w:val="24"/>
+        </w:rPr>
+        <w:t xml:space="preserve">Randomness: REPEAT_CHANCE is the chance of repeating a pitch instead of swapping. Set it to 0 for a perfectly regular pulse, or higher to make it less predictable.</w:t>
+      </w:r>
+    </w:p>
+    <w:p>
+      <w:pPr>
+        <w:pStyle w:val="ListParagraph"/>
+        <w:numPr>
+          <w:ilvl w:val="0"/>
+          <w:numId w:val="2"/>
+        </w:numPr>
+        <w:spacing w:after="80"/>
+      </w:pPr>
+      <w:r>
+        <w:rPr>
+          <w:rFonts w:ascii="Times New Roman" w:cs="Times New Roman" w:eastAsia="Times New Roman" w:hAnsi="Times New Roman"/>
+          <w:sz w:val="24"/>
+          <w:szCs w:val="24"/>
+        </w:rPr>
+        <w:t xml:space="preserve">Difficulty: tempoForLevel slides from TEMPO_EASY on level 1 to TEMPO_HARD on the last level, so the same pattern plays faster as the game gets harder.</w:t>
       </w:r>
     </w:p>
     <w:p>
@@ -440,289 +320,97 @@
           <w:sz w:val="24"/>
           <w:szCs w:val="24"/>
         </w:rPr>
-        <w:t xml:space="preserve">Settings at the top: tempo, number of bars, the scale, the note-length weights, the step weights and the chords.</w:t>
-      </w:r>
-    </w:p>
-    <w:p>
-      <w:pPr>
-        <w:pStyle w:val="ListParagraph"/>
-        <w:numPr>
-          <w:ilvl w:val="0"/>
-          <w:numId w:val="2"/>
-        </w:numPr>
-        <w:spacing w:after="80"/>
-      </w:pPr>
-      <w:r>
-        <w:rPr>
-          <w:rFonts w:ascii="Times New Roman" w:cs="Times New Roman" w:eastAsia="Times New Roman" w:hAnsi="Times New Roman"/>
-          <w:sz w:val="24"/>
-          <w:szCs w:val="24"/>
-        </w:rPr>
-        <w:t xml:space="preserve">Helpers: </w:t>
-      </w:r>
-      <w:r>
-        <w:rPr>
-          <w:rFonts w:ascii="Courier New" w:cs="Courier New" w:eastAsia="Courier New" w:hAnsi="Courier New"/>
-          <w:sz w:val="21"/>
-          <w:szCs w:val="21"/>
-        </w:rPr>
-        <w:t xml:space="preserve">free_rhythm</w:t>
-      </w:r>
-      <w:r>
-        <w:rPr>
-          <w:rFonts w:ascii="Times New Roman" w:cs="Times New Roman" w:eastAsia="Times New Roman" w:hAnsi="Times New Roman"/>
-          <w:sz w:val="24"/>
-          <w:szCs w:val="24"/>
-        </w:rPr>
-        <w:t xml:space="preserve">, </w:t>
-      </w:r>
-      <w:r>
-        <w:rPr>
-          <w:rFonts w:ascii="Courier New" w:cs="Courier New" w:eastAsia="Courier New" w:hAnsi="Courier New"/>
-          <w:sz w:val="21"/>
-          <w:szCs w:val="21"/>
-        </w:rPr>
-        <w:t xml:space="preserve">ruled_rhythm</w:t>
-      </w:r>
-      <w:r>
-        <w:rPr>
-          <w:rFonts w:ascii="Times New Roman" w:cs="Times New Roman" w:eastAsia="Times New Roman" w:hAnsi="Times New Roman"/>
-          <w:sz w:val="24"/>
-          <w:szCs w:val="24"/>
-        </w:rPr>
-        <w:t xml:space="preserve">, </w:t>
-      </w:r>
-      <w:r>
-        <w:rPr>
-          <w:rFonts w:ascii="Courier New" w:cs="Courier New" w:eastAsia="Courier New" w:hAnsi="Courier New"/>
-          <w:sz w:val="21"/>
-          <w:szCs w:val="21"/>
-        </w:rPr>
-        <w:t xml:space="preserve">chord_for_bar</w:t>
-      </w:r>
-      <w:r>
-        <w:rPr>
-          <w:rFonts w:ascii="Times New Roman" w:cs="Times New Roman" w:eastAsia="Times New Roman" w:hAnsi="Times New Roman"/>
-          <w:sz w:val="24"/>
-          <w:szCs w:val="24"/>
-        </w:rPr>
-        <w:t xml:space="preserve"> and </w:t>
-      </w:r>
-      <w:r>
-        <w:rPr>
-          <w:rFonts w:ascii="Courier New" w:cs="Courier New" w:eastAsia="Courier New" w:hAnsi="Courier New"/>
-          <w:sz w:val="21"/>
-          <w:szCs w:val="21"/>
-        </w:rPr>
-        <w:t xml:space="preserve">add_starts</w:t>
-      </w:r>
-      <w:r>
-        <w:rPr>
-          <w:rFonts w:ascii="Times New Roman" w:cs="Times New Roman" w:eastAsia="Times New Roman" w:hAnsi="Times New Roman"/>
-          <w:sz w:val="24"/>
-          <w:szCs w:val="24"/>
-        </w:rPr>
-        <w:t xml:space="preserve">.</w:t>
-      </w:r>
-    </w:p>
-    <w:p>
-      <w:pPr>
-        <w:pStyle w:val="ListParagraph"/>
-        <w:numPr>
-          <w:ilvl w:val="0"/>
-          <w:numId w:val="2"/>
-        </w:numPr>
-        <w:spacing w:after="80"/>
-      </w:pPr>
-      <w:r>
-        <w:rPr>
-          <w:rFonts w:ascii="Times New Roman" w:cs="Times New Roman" w:eastAsia="Times New Roman" w:hAnsi="Times New Roman"/>
-          <w:sz w:val="24"/>
-          <w:szCs w:val="24"/>
-        </w:rPr>
-        <w:t xml:space="preserve">The four versions: </w:t>
-      </w:r>
-      <w:r>
-        <w:rPr>
-          <w:rFonts w:ascii="Courier New" w:cs="Courier New" w:eastAsia="Courier New" w:hAnsi="Courier New"/>
-          <w:sz w:val="21"/>
-          <w:szCs w:val="21"/>
-        </w:rPr>
-        <w:t xml:space="preserve">version_a</w:t>
-      </w:r>
-      <w:r>
-        <w:rPr>
-          <w:rFonts w:ascii="Times New Roman" w:cs="Times New Roman" w:eastAsia="Times New Roman" w:hAnsi="Times New Roman"/>
-          <w:sz w:val="24"/>
-          <w:szCs w:val="24"/>
-        </w:rPr>
-        <w:t xml:space="preserve"> to </w:t>
-      </w:r>
-      <w:r>
-        <w:rPr>
-          <w:rFonts w:ascii="Courier New" w:cs="Courier New" w:eastAsia="Courier New" w:hAnsi="Courier New"/>
-          <w:sz w:val="21"/>
-          <w:szCs w:val="21"/>
-        </w:rPr>
-        <w:t xml:space="preserve">version_d</w:t>
-      </w:r>
-      <w:r>
-        <w:rPr>
-          <w:rFonts w:ascii="Times New Roman" w:cs="Times New Roman" w:eastAsia="Times New Roman" w:hAnsi="Times New Roman"/>
-          <w:sz w:val="24"/>
-          <w:szCs w:val="24"/>
-        </w:rPr>
-        <w:t xml:space="preserve">. Each takes a seed and returns the melody and the bass notes.</w:t>
-      </w:r>
-    </w:p>
-    <w:p>
-      <w:pPr>
-        <w:pStyle w:val="ListParagraph"/>
-        <w:numPr>
-          <w:ilvl w:val="0"/>
-          <w:numId w:val="2"/>
-        </w:numPr>
-        <w:spacing w:after="80"/>
-      </w:pPr>
-      <w:r>
-        <w:rPr>
-          <w:rFonts w:ascii="Times New Roman" w:cs="Times New Roman" w:eastAsia="Times New Roman" w:hAnsi="Times New Roman"/>
-          <w:sz w:val="24"/>
-          <w:szCs w:val="24"/>
-        </w:rPr>
-        <w:t xml:space="preserve">Metrics: </w:t>
-      </w:r>
-      <w:r>
-        <w:rPr>
-          <w:rFonts w:ascii="Courier New" w:cs="Courier New" w:eastAsia="Courier New" w:hAnsi="Courier New"/>
-          <w:sz w:val="21"/>
-          <w:szCs w:val="21"/>
-        </w:rPr>
-        <w:t xml:space="preserve">measure</w:t>
-      </w:r>
-      <w:r>
-        <w:rPr>
-          <w:rFonts w:ascii="Times New Roman" w:cs="Times New Roman" w:eastAsia="Times New Roman" w:hAnsi="Times New Roman"/>
-          <w:sz w:val="24"/>
-          <w:szCs w:val="24"/>
-        </w:rPr>
-        <w:t xml:space="preserve"> works out the values for one piece, and </w:t>
-      </w:r>
-      <w:r>
-        <w:rPr>
-          <w:rFonts w:ascii="Courier New" w:cs="Courier New" w:eastAsia="Courier New" w:hAnsi="Courier New"/>
-          <w:sz w:val="21"/>
-          <w:szCs w:val="21"/>
-        </w:rPr>
-        <w:t xml:space="preserve">difference</w:t>
-      </w:r>
-      <w:r>
-        <w:rPr>
-          <w:rFonts w:ascii="Times New Roman" w:cs="Times New Roman" w:eastAsia="Times New Roman" w:hAnsi="Times New Roman"/>
-          <w:sz w:val="24"/>
-          <w:szCs w:val="24"/>
-        </w:rPr>
-        <w:t xml:space="preserve"> compares pieces with each other.</w:t>
-      </w:r>
-    </w:p>
-    <w:p>
-      <w:pPr>
-        <w:pStyle w:val="ListParagraph"/>
-        <w:numPr>
-          <w:ilvl w:val="0"/>
-          <w:numId w:val="2"/>
-        </w:numPr>
-        <w:spacing w:after="80"/>
-      </w:pPr>
-      <w:r>
-        <w:rPr>
-          <w:rFonts w:ascii="Times New Roman" w:cs="Times New Roman" w:eastAsia="Times New Roman" w:hAnsi="Times New Roman"/>
-          <w:sz w:val="24"/>
-          <w:szCs w:val="24"/>
-        </w:rPr>
-        <w:t xml:space="preserve">Output: </w:t>
-      </w:r>
-      <w:r>
-        <w:rPr>
-          <w:rFonts w:ascii="Courier New" w:cs="Courier New" w:eastAsia="Courier New" w:hAnsi="Courier New"/>
-          <w:sz w:val="21"/>
-          <w:szCs w:val="21"/>
-        </w:rPr>
-        <w:t xml:space="preserve">save_midi</w:t>
-      </w:r>
-      <w:r>
-        <w:rPr>
-          <w:rFonts w:ascii="Times New Roman" w:cs="Times New Roman" w:eastAsia="Times New Roman" w:hAnsi="Times New Roman"/>
-          <w:sz w:val="24"/>
-          <w:szCs w:val="24"/>
-        </w:rPr>
-        <w:t xml:space="preserve"> writes the MIDI file with MIDIUtil, </w:t>
-      </w:r>
-      <w:r>
-        <w:rPr>
-          <w:rFonts w:ascii="Courier New" w:cs="Courier New" w:eastAsia="Courier New" w:hAnsi="Courier New"/>
-          <w:sz w:val="21"/>
-          <w:szCs w:val="21"/>
-        </w:rPr>
-        <w:t xml:space="preserve">save_csv</w:t>
-      </w:r>
-      <w:r>
-        <w:rPr>
-          <w:rFonts w:ascii="Times New Roman" w:cs="Times New Roman" w:eastAsia="Times New Roman" w:hAnsi="Times New Roman"/>
-          <w:sz w:val="24"/>
-          <w:szCs w:val="24"/>
-        </w:rPr>
-        <w:t xml:space="preserve"> writes the note list and </w:t>
-      </w:r>
-      <w:r>
-        <w:rPr>
-          <w:rFonts w:ascii="Courier New" w:cs="Courier New" w:eastAsia="Courier New" w:hAnsi="Courier New"/>
-          <w:sz w:val="21"/>
-          <w:szCs w:val="21"/>
-        </w:rPr>
-        <w:t xml:space="preserve">draw_piano_rolls</w:t>
-      </w:r>
-      <w:r>
-        <w:rPr>
-          <w:rFonts w:ascii="Times New Roman" w:cs="Times New Roman" w:eastAsia="Times New Roman" w:hAnsi="Times New Roman"/>
-          <w:sz w:val="24"/>
-          <w:szCs w:val="24"/>
-        </w:rPr>
-        <w:t xml:space="preserve"> draws the figures.</w:t>
-      </w:r>
-    </w:p>
-    <w:p>
-      <w:pPr>
-        <w:pStyle w:val="ListParagraph"/>
-        <w:numPr>
-          <w:ilvl w:val="0"/>
-          <w:numId w:val="2"/>
-        </w:numPr>
-        <w:spacing w:after="80"/>
-      </w:pPr>
-      <w:r>
-        <w:rPr>
-          <w:rFonts w:ascii="Times New Roman" w:cs="Times New Roman" w:eastAsia="Times New Roman" w:hAnsi="Times New Roman"/>
-          <w:sz w:val="24"/>
-          <w:szCs w:val="24"/>
-        </w:rPr>
-        <w:t xml:space="preserve">Main: </w:t>
-      </w:r>
-      <w:r>
-        <w:rPr>
-          <w:rFonts w:ascii="Courier New" w:cs="Courier New" w:eastAsia="Courier New" w:hAnsi="Courier New"/>
-          <w:sz w:val="21"/>
-          <w:szCs w:val="21"/>
-        </w:rPr>
-        <w:t xml:space="preserve">main</w:t>
-      </w:r>
-      <w:r>
-        <w:rPr>
-          <w:rFonts w:ascii="Times New Roman" w:cs="Times New Roman" w:eastAsia="Times New Roman" w:hAnsi="Times New Roman"/>
-          <w:sz w:val="24"/>
-          <w:szCs w:val="24"/>
-        </w:rPr>
-        <w:t xml:space="preserve"> makes the samples, compares 200 pieces per version, runs the PCG checks, the sample size check and the step weight check, and makes three level pieces for the game demo.</w:t>
+        <w:t xml:space="preserve">Settings at the top: the two notes, how many levels and beats, the easy and hard tempos, and the repeat chance. Everything you would want to change is here.</w:t>
+      </w:r>
+    </w:p>
+    <w:p>
+      <w:pPr>
+        <w:pStyle w:val="ListParagraph"/>
+        <w:numPr>
+          <w:ilvl w:val="0"/>
+          <w:numId w:val="2"/>
+        </w:numPr>
+        <w:spacing w:after="80"/>
+      </w:pPr>
+      <w:r>
+        <w:rPr>
+          <w:rFonts w:ascii="Times New Roman" w:cs="Times New Roman" w:eastAsia="Times New Roman" w:hAnsi="Times New Roman"/>
+          <w:sz w:val="24"/>
+          <w:szCs w:val="24"/>
+        </w:rPr>
+        <w:t xml:space="preserve">tempoForLevel turns a level number into a tempo in beats per minute.</w:t>
+      </w:r>
+    </w:p>
+    <w:p>
+      <w:pPr>
+        <w:pStyle w:val="ListParagraph"/>
+        <w:numPr>
+          <w:ilvl w:val="0"/>
+          <w:numId w:val="2"/>
+        </w:numPr>
+        <w:spacing w:after="80"/>
+      </w:pPr>
+      <w:r>
+        <w:rPr>
+          <w:rFonts w:ascii="Times New Roman" w:cs="Times New Roman" w:eastAsia="Times New Roman" w:hAnsi="Times New Roman"/>
+          <w:sz w:val="24"/>
+          <w:szCs w:val="24"/>
+        </w:rPr>
+        <w:t xml:space="preserve">makePattern builds the array of notes for one level, and is where the alternating and the random repeats happen.</w:t>
+      </w:r>
+    </w:p>
+    <w:p>
+      <w:pPr>
+        <w:pStyle w:val="ListParagraph"/>
+        <w:numPr>
+          <w:ilvl w:val="0"/>
+          <w:numId w:val="2"/>
+        </w:numPr>
+        <w:spacing w:after="80"/>
+      </w:pPr>
+      <w:r>
+        <w:rPr>
+          <w:rFonts w:ascii="Times New Roman" w:cs="Times New Roman" w:eastAsia="Times New Roman" w:hAnsi="Times New Roman"/>
+          <w:sz w:val="24"/>
+          <w:szCs w:val="24"/>
+        </w:rPr>
+        <w:t xml:space="preserve">saveMidi writes a two-track MIDI file, one track for the melody and one for the drum, using javax.sound.midi.</w:t>
+      </w:r>
+    </w:p>
+    <w:p>
+      <w:pPr>
+        <w:pStyle w:val="ListParagraph"/>
+        <w:numPr>
+          <w:ilvl w:val="0"/>
+          <w:numId w:val="2"/>
+        </w:numPr>
+        <w:spacing w:after="80"/>
+      </w:pPr>
+      <w:r>
+        <w:rPr>
+          <w:rFonts w:ascii="Times New Roman" w:cs="Times New Roman" w:eastAsia="Times New Roman" w:hAnsi="Times New Roman"/>
+          <w:sz w:val="24"/>
+          <w:szCs w:val="24"/>
+        </w:rPr>
+        <w:t xml:space="preserve">savePicture draws all the patterns into one PNG using java.awt, and countRepeats counts how often a note was repeated.</w:t>
+      </w:r>
+    </w:p>
+    <w:p>
+      <w:pPr>
+        <w:pStyle w:val="ListParagraph"/>
+        <w:numPr>
+          <w:ilvl w:val="0"/>
+          <w:numId w:val="2"/>
+        </w:numPr>
+        <w:spacing w:after="80"/>
+      </w:pPr>
+      <w:r>
+        <w:rPr>
+          <w:rFonts w:ascii="Times New Roman" w:cs="Times New Roman" w:eastAsia="Times New Roman" w:hAnsi="Times New Roman"/>
+          <w:sz w:val="24"/>
+          <w:szCs w:val="24"/>
+        </w:rPr>
+        <w:t xml:space="preserve">main runs the whole thing: one piece per level, saved to disk, with a summary table printed to the screen.</w:t>
       </w:r>
     </w:p>
     <w:p>
@@ -756,109 +444,61 @@
           <w:sz w:val="24"/>
           <w:szCs w:val="24"/>
         </w:rPr>
-        <w:t xml:space="preserve">Run everything: run the script and get the </w:t>
-      </w:r>
-      <w:r>
-        <w:rPr>
-          <w:rFonts w:ascii="Courier New" w:cs="Courier New" w:eastAsia="Courier New" w:hAnsi="Courier New"/>
-          <w:sz w:val="21"/>
-          <w:szCs w:val="21"/>
-        </w:rPr>
-        <w:t xml:space="preserve">results</w:t>
-      </w:r>
-      <w:r>
-        <w:rPr>
-          <w:rFonts w:ascii="Times New Roman" w:cs="Times New Roman" w:eastAsia="Times New Roman" w:hAnsi="Times New Roman"/>
-          <w:sz w:val="24"/>
-          <w:szCs w:val="24"/>
-        </w:rPr>
-        <w:t xml:space="preserve"> folder.</w:t>
-      </w:r>
-    </w:p>
-    <w:p>
-      <w:pPr>
-        <w:pStyle w:val="ListParagraph"/>
-        <w:numPr>
-          <w:ilvl w:val="0"/>
-          <w:numId w:val="2"/>
-        </w:numPr>
-        <w:spacing w:after="80"/>
-      </w:pPr>
-      <w:r>
-        <w:rPr>
-          <w:rFonts w:ascii="Times New Roman" w:cs="Times New Roman" w:eastAsia="Times New Roman" w:hAnsi="Times New Roman"/>
-          <w:sz w:val="24"/>
-          <w:szCs w:val="24"/>
-        </w:rPr>
-        <w:t xml:space="preserve">Make one piece: </w:t>
-      </w:r>
-      <w:r>
-        <w:rPr>
-          <w:rFonts w:ascii="Courier New" w:cs="Courier New" w:eastAsia="Courier New" w:hAnsi="Courier New"/>
-          <w:sz w:val="21"/>
-          <w:szCs w:val="21"/>
-        </w:rPr>
-        <w:t xml:space="preserve">version_d(7)</w:t>
-      </w:r>
-      <w:r>
-        <w:rPr>
-          <w:rFonts w:ascii="Times New Roman" w:cs="Times New Roman" w:eastAsia="Times New Roman" w:hAnsi="Times New Roman"/>
-          <w:sz w:val="24"/>
-          <w:szCs w:val="24"/>
-        </w:rPr>
-        <w:t xml:space="preserve"> gives a full piece for seed 7. The same seed always gives the same piece.</w:t>
-      </w:r>
-    </w:p>
-    <w:p>
-      <w:pPr>
-        <w:pStyle w:val="ListParagraph"/>
-        <w:numPr>
-          <w:ilvl w:val="0"/>
-          <w:numId w:val="2"/>
-        </w:numPr>
-        <w:spacing w:after="80"/>
-      </w:pPr>
-      <w:r>
-        <w:rPr>
-          <w:rFonts w:ascii="Times New Roman" w:cs="Times New Roman" w:eastAsia="Times New Roman" w:hAnsi="Times New Roman"/>
-          <w:sz w:val="24"/>
-          <w:szCs w:val="24"/>
-        </w:rPr>
-        <w:t xml:space="preserve">Music for a game level: use the level number as the seed, so each level always gets its own piece without storing any audio.</w:t>
-      </w:r>
-    </w:p>
-    <w:p>
-      <w:pPr>
-        <w:pStyle w:val="ListParagraph"/>
-        <w:numPr>
-          <w:ilvl w:val="0"/>
-          <w:numId w:val="2"/>
-        </w:numPr>
-        <w:spacing w:after="80"/>
-      </w:pPr>
-      <w:r>
-        <w:rPr>
-          <w:rFonts w:ascii="Times New Roman" w:cs="Times New Roman" w:eastAsia="Times New Roman" w:hAnsi="Times New Roman"/>
-          <w:sz w:val="24"/>
-          <w:szCs w:val="24"/>
-        </w:rPr>
-        <w:t xml:space="preserve">Measure a piece: </w:t>
-      </w:r>
-      <w:r>
-        <w:rPr>
-          <w:rFonts w:ascii="Courier New" w:cs="Courier New" w:eastAsia="Courier New" w:hAnsi="Courier New"/>
-          <w:sz w:val="21"/>
-          <w:szCs w:val="21"/>
-        </w:rPr>
-        <w:t xml:space="preserve">measure(melody)</w:t>
-      </w:r>
-      <w:r>
-        <w:rPr>
-          <w:rFonts w:ascii="Times New Roman" w:cs="Times New Roman" w:eastAsia="Times New Roman" w:hAnsi="Times New Roman"/>
-          <w:sz w:val="24"/>
-          <w:szCs w:val="24"/>
-        </w:rPr>
-        <w:t xml:space="preserve"> gives back values such as the share of notes in key and the average jump.</w:t>
+        <w:t xml:space="preserve">Run everything: run the program and get five MIDI files and the picture.</w:t>
+      </w:r>
+    </w:p>
+    <w:p>
+      <w:pPr>
+        <w:pStyle w:val="ListParagraph"/>
+        <w:numPr>
+          <w:ilvl w:val="0"/>
+          <w:numId w:val="2"/>
+        </w:numPr>
+        <w:spacing w:after="80"/>
+      </w:pPr>
+      <w:r>
+        <w:rPr>
+          <w:rFonts w:ascii="Times New Roman" w:cs="Times New Roman" w:eastAsia="Times New Roman" w:hAnsi="Times New Roman"/>
+          <w:sz w:val="24"/>
+          <w:szCs w:val="24"/>
+        </w:rPr>
+        <w:t xml:space="preserve">Music for one level: makePattern(3) gives the note pattern for level 3, and tempoForLevel(3) gives its tempo.</w:t>
+      </w:r>
+    </w:p>
+    <w:p>
+      <w:pPr>
+        <w:pStyle w:val="ListParagraph"/>
+        <w:numPr>
+          <w:ilvl w:val="0"/>
+          <w:numId w:val="2"/>
+        </w:numPr>
+        <w:spacing w:after="80"/>
+      </w:pPr>
+      <w:r>
+        <w:rPr>
+          <w:rFonts w:ascii="Times New Roman" w:cs="Times New Roman" w:eastAsia="Times New Roman" w:hAnsi="Times New Roman"/>
+          <w:sz w:val="24"/>
+          <w:szCs w:val="24"/>
+        </w:rPr>
+        <w:t xml:space="preserve">Change the difficulty curve: edit TEMPO_EASY and TEMPO_HARD to make the levels speed up more or less sharply.</w:t>
+      </w:r>
+    </w:p>
+    <w:p>
+      <w:pPr>
+        <w:pStyle w:val="ListParagraph"/>
+        <w:numPr>
+          <w:ilvl w:val="0"/>
+          <w:numId w:val="2"/>
+        </w:numPr>
+        <w:spacing w:after="80"/>
+      </w:pPr>
+      <w:r>
+        <w:rPr>
+          <w:rFonts w:ascii="Times New Roman" w:cs="Times New Roman" w:eastAsia="Times New Roman" w:hAnsi="Times New Roman"/>
+          <w:sz w:val="24"/>
+          <w:szCs w:val="24"/>
+        </w:rPr>
+        <w:t xml:space="preserve">Change how random it is: edit REPEAT_CHANCE. Zero gives a strict alternation, higher values break the pulse more often.</w:t>
       </w:r>
     </w:p>
     <w:p>
@@ -892,43 +532,43 @@
           <w:sz w:val="24"/>
           <w:szCs w:val="24"/>
         </w:rPr>
-        <w:t xml:space="preserve">The measures describe structure, not how good the music sounds to a listener.</w:t>
-      </w:r>
-    </w:p>
-    <w:p>
-      <w:pPr>
-        <w:pStyle w:val="ListParagraph"/>
-        <w:numPr>
-          <w:ilvl w:val="0"/>
-          <w:numId w:val="2"/>
-        </w:numPr>
-        <w:spacing w:after="80"/>
-      </w:pPr>
-      <w:r>
-        <w:rPr>
-          <w:rFonts w:ascii="Times New Roman" w:cs="Times New Roman" w:eastAsia="Times New Roman" w:hAnsi="Times New Roman"/>
-          <w:sz w:val="24"/>
-          <w:szCs w:val="24"/>
-        </w:rPr>
-        <w:t xml:space="preserve">Only C major, one tempo and one chord loop are used.</w:t>
-      </w:r>
-    </w:p>
-    <w:p>
-      <w:pPr>
-        <w:pStyle w:val="ListParagraph"/>
-        <w:numPr>
-          <w:ilvl w:val="0"/>
-          <w:numId w:val="2"/>
-        </w:numPr>
-        <w:spacing w:after="80"/>
-      </w:pPr>
-      <w:r>
-        <w:rPr>
-          <w:rFonts w:ascii="Times New Roman" w:cs="Times New Roman" w:eastAsia="Times New Roman" w:hAnsi="Times New Roman"/>
-          <w:sz w:val="24"/>
-          <w:szCs w:val="24"/>
-        </w:rPr>
-        <w:t xml:space="preserve">The pieces have no repeated themes, so longer pieces could sound aimless.</w:t>
+        <w:t xml:space="preserve">With only two pitches there is no real melody, so the result is closer to an adaptive pulse than to a tune.</w:t>
+      </w:r>
+    </w:p>
+    <w:p>
+      <w:pPr>
+        <w:pStyle w:val="ListParagraph"/>
+        <w:numPr>
+          <w:ilvl w:val="0"/>
+          <w:numId w:val="2"/>
+        </w:numPr>
+        <w:spacing w:after="80"/>
+      </w:pPr>
+      <w:r>
+        <w:rPr>
+          <w:rFonts w:ascii="Times New Roman" w:cs="Times New Roman" w:eastAsia="Times New Roman" w:hAnsi="Times New Roman"/>
+          <w:sz w:val="24"/>
+          <w:szCs w:val="24"/>
+        </w:rPr>
+        <w:t xml:space="preserve">Tempo is the only thing difficulty changes. The notes and the drum are the same on every level.</w:t>
+      </w:r>
+    </w:p>
+    <w:p>
+      <w:pPr>
+        <w:pStyle w:val="ListParagraph"/>
+        <w:numPr>
+          <w:ilvl w:val="0"/>
+          <w:numId w:val="2"/>
+        </w:numPr>
+        <w:spacing w:after="80"/>
+      </w:pPr>
+      <w:r>
+        <w:rPr>
+          <w:rFonts w:ascii="Times New Roman" w:cs="Times New Roman" w:eastAsia="Times New Roman" w:hAnsi="Times New Roman"/>
+          <w:sz w:val="24"/>
+          <w:szCs w:val="24"/>
+        </w:rPr>
+        <w:t xml:space="preserve">Nothing was tested with listeners, so the idea that faster music feels harder is an assumption, not a result.</w:t>
       </w:r>
     </w:p>
     <w:sectPr>

</xml_diff>

<commit_message>
Simplify the generator for readability
Whole-number arithmetic throughout. The tempo is interpolated with integer
division, which gives the same 80, 110, 140, 170, 200 as before, and the
repeat decision now draws 0 to 99 and compares against REPEAT_PERCENT
instead of using a double. No numeric casts remain; the only byte casts
left are the three MIDI needs for the tempo meta message.

Comments are block comments above each method rather than a line each,
and the divider bars are gone.

Changing the random draw shifts the patterns, so the repeat counts are
now 7, 7, 6, 8 and 14. The report, code documentation and README are
updated to match, including the figure.
</commit_message>
<xml_diff>
--- a/Code_Documentation.docx
+++ b/Code_Documentation.docx
@@ -170,7 +170,7 @@
           <w:sz w:val="24"/>
           <w:szCs w:val="24"/>
         </w:rPr>
-        <w:t xml:space="preserve">A piece is an array of thirty-two MIDI note numbers, one per beat. The generator starts on the low C and walks through the beats. On each beat it normally swaps to the other pitch, which gives the alternation low, high, low, high. With a probability of 0.25 it keeps the current pitch instead, which shifts the pattern and is what makes each level different. The level number seeds the random number generator, so a level always gets the same music.</w:t>
+        <w:t xml:space="preserve">A piece is an array of thirty-two MIDI note numbers, one per beat. The generator starts on the low C and walks through the beats. On each beat it normally swaps to the other pitch, which gives the alternation low, high, low, high. It draws a whole number from 0 to 99 and, when that falls below 25, keeps the current pitch instead, which shifts the pattern and is what makes each level different. The level number seeds the random number generator, so a level always gets the same music.</w:t>
       </w:r>
     </w:p>
     <w:p>
@@ -180,42 +180,42 @@
       </w:pPr>
       <w:r>
         <w:drawing>
-          <ns2:inline distT="0" distB="0" distL="0" distR="0">
-            <ns2:extent cx="5715000" cy="2761450"/>
-            <ns2:effectExtent t="0" r="0" b="0" l="0"/>
-            <ns2:docPr id="1" name="" descr="" title=""/>
-            <ns2:cNvGraphicFramePr>
-              <ns3:graphicFrameLocks noChangeAspect="1"/>
-            </ns2:cNvGraphicFramePr>
-            <ns3:graphic>
-              <ns3:graphicData uri="http://schemas.openxmlformats.org/drawingml/2006/picture">
-                <ns4:pic>
-                  <ns4:nvPicPr>
-                    <ns4:cNvPr id="0" name="" descr=""/>
-                    <ns4:cNvPicPr>
-                      <ns3:picLocks noChangeAspect="1" noChangeArrowheads="1"/>
-                    </ns4:cNvPicPr>
-                  </ns4:nvPicPr>
-                  <ns4:blipFill>
-                    <ns3:blip ns5:embed="rId7" cstate="none"/>
-                    <ns3:srcRect/>
-                    <ns3:stretch>
-                      <ns3:fillRect/>
-                    </ns3:stretch>
-                  </ns4:blipFill>
-                  <ns4:spPr bwMode="auto">
-                    <ns3:xfrm>
-                      <ns3:off x="0" y="0"/>
-                      <ns3:ext cx="5715000" cy="2761450"/>
-                    </ns3:xfrm>
-                    <ns3:prstGeom prst="rect">
-                      <ns3:avLst/>
-                    </ns3:prstGeom>
-                  </ns4:spPr>
-                </ns4:pic>
-              </ns3:graphicData>
-            </ns3:graphic>
-          </ns2:inline>
+          <wp:inline distT="0" distB="0" distL="0" distR="0">
+            <wp:extent cx="5715000" cy="2761450"/>
+            <wp:effectExtent t="0" r="0" b="0" l="0"/>
+            <wp:docPr id="1" name="" descr="" title=""/>
+            <wp:cNvGraphicFramePr>
+              <a:graphicFrameLocks noChangeAspect="1"/>
+            </wp:cNvGraphicFramePr>
+            <a:graphic>
+              <a:graphicData uri="http://schemas.openxmlformats.org/drawingml/2006/picture">
+                <pic:pic>
+                  <pic:nvPicPr>
+                    <pic:cNvPr id="0" name="" descr=""/>
+                    <pic:cNvPicPr>
+                      <a:picLocks noChangeAspect="1" noChangeArrowheads="1"/>
+                    </pic:cNvPicPr>
+                  </pic:nvPicPr>
+                  <pic:blipFill>
+                    <a:blip r:embed="rId7" cstate="none"/>
+                    <a:srcRect/>
+                    <a:stretch>
+                      <a:fillRect/>
+                    </a:stretch>
+                  </pic:blipFill>
+                  <pic:spPr bwMode="auto">
+                    <a:xfrm>
+                      <a:off x="0" y="0"/>
+                      <a:ext cx="5715000" cy="2761450"/>
+                    </a:xfrm>
+                    <a:prstGeom prst="rect">
+                      <a:avLst/>
+                    </a:prstGeom>
+                  </pic:spPr>
+                </pic:pic>
+              </a:graphicData>
+            </a:graphic>
+          </wp:inline>
         </w:drawing>
       </w:r>
     </w:p>
@@ -268,7 +268,7 @@
           <w:sz w:val="24"/>
           <w:szCs w:val="24"/>
         </w:rPr>
-        <w:t xml:space="preserve">Randomness: REPEAT_CHANCE is the chance of repeating a pitch instead of swapping. Set it to 0 for a perfectly regular pulse, or higher to make it less predictable.</w:t>
+        <w:t xml:space="preserve">Randomness: REPEAT_PERCENT is how often, out of 100, a note repeats instead of swapping. Set it to 0 for a perfectly regular pulse, or higher to make it less predictable.</w:t>
       </w:r>
     </w:p>
     <w:p>
@@ -498,7 +498,7 @@
           <w:sz w:val="24"/>
           <w:szCs w:val="24"/>
         </w:rPr>
-        <w:t xml:space="preserve">Change how random it is: edit REPEAT_CHANCE. Zero gives a strict alternation, higher values break the pulse more often.</w:t>
+        <w:t xml:space="preserve">Change how random it is: edit REPEAT_PERCENT. Zero gives a strict alternation, higher values break the pulse more often.</w:t>
       </w:r>
     </w:p>
     <w:p>

</xml_diff>

<commit_message>
Run in one command, and fix a hang on exit
java MusicGenerator.java compiles and runs in one step, since the whole
program is one file. The two-step javac route is kept as a note for
anyone on a Java older than 11.

Drawing the figure starts the AWT toolkit, which leaves a non-daemon
thread alive and stops the JVM exiting once main returns. The program
finished its work but never returned to the shell. Setting
java.awt.headless before any drawing fixes it; five consecutive runs now
exit with status 0 in about a second each.
</commit_message>
<xml_diff>
--- a/Code_Documentation.docx
+++ b/Code_Documentation.docx
@@ -87,7 +87,7 @@
           <w:sz w:val="24"/>
           <w:szCs w:val="24"/>
         </w:rPr>
-        <w:t xml:space="preserve">Compile it once:</w:t>
+        <w:t xml:space="preserve">Run it from the project folder:</w:t>
       </w:r>
     </w:p>
     <w:p>
@@ -101,7 +101,7 @@
           <w:sz w:val="21"/>
           <w:szCs w:val="21"/>
         </w:rPr>
-        <w:t xml:space="preserve">javac MusicGenerator.java</w:t>
+        <w:t xml:space="preserve">java MusicGenerator.java</w:t>
       </w:r>
     </w:p>
     <w:p>
@@ -114,21 +114,7 @@
           <w:sz w:val="24"/>
           <w:szCs w:val="24"/>
         </w:rPr>
-        <w:t xml:space="preserve">Then run it from the project folder:</w:t>
-      </w:r>
-    </w:p>
-    <w:p>
-      <w:pPr>
-        <w:spacing w:after="100"/>
-        <w:ind w:left="400"/>
-      </w:pPr>
-      <w:r>
-        <w:rPr>
-          <w:rFonts w:ascii="Courier New" w:cs="Courier New" w:eastAsia="Courier New" w:hAnsi="Courier New"/>
-          <w:sz w:val="21"/>
-          <w:szCs w:val="21"/>
-        </w:rPr>
-        <w:t xml:space="preserve">java MusicGenerator</w:t>
+        <w:t xml:space="preserve">That one command compiles and runs the program, because the whole thing is a single file. Java 11 and later allow this. On an older Java, compile first with javac MusicGenerator.java and then run java MusicGenerator.</w:t>
       </w:r>
     </w:p>
     <w:p>

</xml_diff>

<commit_message>
Rename the tempo and randomness settings
tempoEasy is now tempoBase, tempoStep is tempoIncrement, and
repeatPercent is noteRandomness.

The README and code documentation were still naming the old ALL_CAPS
constants from two renames ago, so both are brought back in line with
the source. Every identifier named in any document now exists in the
code.

Byte-identical MIDI.
</commit_message>
<xml_diff>
--- a/Code_Documentation.docx
+++ b/Code_Documentation.docx
@@ -236,43 +236,43 @@
           <w:sz w:val="24"/>
           <w:szCs w:val="24"/>
         </w:rPr>
-        <w:t xml:space="preserve">Two pitches: LOW_NOTE is MIDI 60 and HIGH_NOTE is MIDI 72, the same note one octave apart, so they always sound right together.</w:t>
-      </w:r>
-    </w:p>
-    <w:p>
-      <w:pPr>
-        <w:pStyle w:val="ListParagraph"/>
-        <w:numPr>
-          <w:ilvl w:val="0"/>
-          <w:numId w:val="2"/>
-        </w:numPr>
-        <w:spacing w:after="80"/>
-      </w:pPr>
-      <w:r>
-        <w:rPr>
-          <w:rFonts w:ascii="Times New Roman" w:cs="Times New Roman" w:eastAsia="Times New Roman" w:hAnsi="Times New Roman"/>
-          <w:sz w:val="24"/>
-          <w:szCs w:val="24"/>
-        </w:rPr>
-        <w:t xml:space="preserve">Randomness: REPEAT_PERCENT is how often, out of 100, a note repeats instead of swapping. Set it to 0 for a perfectly regular pulse, or higher to make it less predictable.</w:t>
-      </w:r>
-    </w:p>
-    <w:p>
-      <w:pPr>
-        <w:pStyle w:val="ListParagraph"/>
-        <w:numPr>
-          <w:ilvl w:val="0"/>
-          <w:numId w:val="2"/>
-        </w:numPr>
-        <w:spacing w:after="80"/>
-      </w:pPr>
-      <w:r>
-        <w:rPr>
-          <w:rFonts w:ascii="Times New Roman" w:cs="Times New Roman" w:eastAsia="Times New Roman" w:hAnsi="Times New Roman"/>
-          <w:sz w:val="24"/>
-          <w:szCs w:val="24"/>
-        </w:rPr>
-        <w:t xml:space="preserve">Difficulty: tempoForLevel slides from TEMPO_EASY on level 1 to TEMPO_HARD on the last level, so the same pattern plays faster as the game gets harder.</w:t>
+        <w:t xml:space="preserve">Two pitches: lowNote is MIDI 60 and highNote is MIDI 72, the same note one octave apart, so they always sound right together.</w:t>
+      </w:r>
+    </w:p>
+    <w:p>
+      <w:pPr>
+        <w:pStyle w:val="ListParagraph"/>
+        <w:numPr>
+          <w:ilvl w:val="0"/>
+          <w:numId w:val="2"/>
+        </w:numPr>
+        <w:spacing w:after="80"/>
+      </w:pPr>
+      <w:r>
+        <w:rPr>
+          <w:rFonts w:ascii="Times New Roman" w:cs="Times New Roman" w:eastAsia="Times New Roman" w:hAnsi="Times New Roman"/>
+          <w:sz w:val="24"/>
+          <w:szCs w:val="24"/>
+        </w:rPr>
+        <w:t xml:space="preserve">Randomness: noteRandomness is how often, out of 100, a note repeats instead of swapping. Set it to 0 for a perfectly regular pulse, or higher to make it less predictable.</w:t>
+      </w:r>
+    </w:p>
+    <w:p>
+      <w:pPr>
+        <w:pStyle w:val="ListParagraph"/>
+        <w:numPr>
+          <w:ilvl w:val="0"/>
+          <w:numId w:val="2"/>
+        </w:numPr>
+        <w:spacing w:after="80"/>
+      </w:pPr>
+      <w:r>
+        <w:rPr>
+          <w:rFonts w:ascii="Times New Roman" w:cs="Times New Roman" w:eastAsia="Times New Roman" w:hAnsi="Times New Roman"/>
+          <w:sz w:val="24"/>
+          <w:szCs w:val="24"/>
+        </w:rPr>
+        <w:t xml:space="preserve">Difficulty: tempoForLevel starts at tempoBase on level 1 and adds tempoIncrement for every level after, so the same pattern plays faster as the game gets harder.</w:t>
       </w:r>
     </w:p>
     <w:p>
@@ -466,25 +466,25 @@
           <w:sz w:val="24"/>
           <w:szCs w:val="24"/>
         </w:rPr>
-        <w:t xml:space="preserve">Change the difficulty curve: edit TEMPO_EASY and TEMPO_HARD to make the levels speed up more or less sharply.</w:t>
-      </w:r>
-    </w:p>
-    <w:p>
-      <w:pPr>
-        <w:pStyle w:val="ListParagraph"/>
-        <w:numPr>
-          <w:ilvl w:val="0"/>
-          <w:numId w:val="2"/>
-        </w:numPr>
-        <w:spacing w:after="80"/>
-      </w:pPr>
-      <w:r>
-        <w:rPr>
-          <w:rFonts w:ascii="Times New Roman" w:cs="Times New Roman" w:eastAsia="Times New Roman" w:hAnsi="Times New Roman"/>
-          <w:sz w:val="24"/>
-          <w:szCs w:val="24"/>
-        </w:rPr>
-        <w:t xml:space="preserve">Change how random it is: edit REPEAT_PERCENT. Zero gives a strict alternation, higher values break the pulse more often.</w:t>
+        <w:t xml:space="preserve">Change the difficulty curve: edit tempoBase to set the starting speed and tempoIncrement to change how much faster each level gets.</w:t>
+      </w:r>
+    </w:p>
+    <w:p>
+      <w:pPr>
+        <w:pStyle w:val="ListParagraph"/>
+        <w:numPr>
+          <w:ilvl w:val="0"/>
+          <w:numId w:val="2"/>
+        </w:numPr>
+        <w:spacing w:after="80"/>
+      </w:pPr>
+      <w:r>
+        <w:rPr>
+          <w:rFonts w:ascii="Times New Roman" w:cs="Times New Roman" w:eastAsia="Times New Roman" w:hAnsi="Times New Roman"/>
+          <w:sz w:val="24"/>
+          <w:szCs w:val="24"/>
+        </w:rPr>
+        <w:t xml:space="preserve">Change how random it is: edit noteRandomness. Zero gives a strict alternation, higher values break the pulse more often.</w:t>
       </w:r>
     </w:p>
     <w:p>

</xml_diff>

<commit_message>
Correct the report and make Figure 1 legible in print
Removes the Left 4 Dead reference from the conclusion and replaces it
with the same point stated plainly. Reference [2] stays, since the
introduction still cites it.

The introduction said generated music can change on every run, directly
after contrasting it with a soundtrack that repeats. This generator is
seeded by the level number, so replaying a level gives the same music.
Reworded so the paper is consistent with itself.

The storage claim now says the game has to run the generator.

Figure 1 printed its labels at about 3.3 pt, which is unreadable on
paper. The drawing code uses larger labels and drops the caption line
that duplicated the figure caption, so they now print at about 7.7 pt.

Two pages, two columns, all numbers unchanged.
</commit_message>
<xml_diff>
--- a/Code_Documentation.docx
+++ b/Code_Documentation.docx
@@ -161,13 +161,14 @@
     </w:p>
     <w:p>
       <w:pPr>
+        <w:keepNext/>
         <w:spacing w:after="60" w:before="60"/>
         <w:jc w:val="center"/>
       </w:pPr>
       <w:r>
         <w:drawing>
           <wp:inline distT="0" distB="0" distL="0" distR="0">
-            <wp:extent cx="5715000" cy="2761450"/>
+            <wp:extent cx="5143500" cy="2485305"/>
             <wp:effectExtent t="0" r="0" b="0" l="0"/>
             <wp:docPr id="1" name="" descr="" title=""/>
             <wp:cNvGraphicFramePr>
@@ -192,7 +193,7 @@
                   <pic:spPr bwMode="auto">
                     <a:xfrm>
                       <a:off x="0" y="0"/>
-                      <a:ext cx="5715000" cy="2761450"/>
+                      <a:ext cx="5143500" cy="2485305"/>
                     </a:xfrm>
                     <a:prstGeom prst="rect">
                       <a:avLst/>
@@ -272,7 +273,7 @@
           <w:sz w:val="24"/>
           <w:szCs w:val="24"/>
         </w:rPr>
-        <w:t xml:space="preserve">Difficulty: tempoForLevel starts at tempoBase on level 1 and adds tempoIncrement for every level after, so the same pattern plays faster as the game gets harder.</w:t>
+        <w:t xml:space="preserve">Difficulty: tempoForLevel starts at tempoBase on level 1 and adds tempoIncrement for every level after, so each thirty-two-note piece plays faster as the game gets harder.</w:t>
       </w:r>
     </w:p>
     <w:p>
@@ -306,7 +307,7 @@
           <w:sz w:val="24"/>
           <w:szCs w:val="24"/>
         </w:rPr>
-        <w:t xml:space="preserve">Settings at the top: the two notes, how many levels and beats, the easy and hard tempos, and the repeat chance. Everything you would want to change is here.</w:t>
+        <w:t xml:space="preserve">Settings at the top: the two notes, how many levels and beats, the base tempo and tempo increment, and the repeat chance. Everything you would want to change is here.</w:t>
       </w:r>
     </w:p>
     <w:p>
@@ -536,7 +537,7 @@
           <w:sz w:val="24"/>
           <w:szCs w:val="24"/>
         </w:rPr>
-        <w:t xml:space="preserve">Tempo is the only thing difficulty changes. The notes and the drum are the same on every level.</w:t>
+        <w:t xml:space="preserve">Difficulty sets the tempo. The level number also seeds the note pattern; the two pitches, repeat chance and drum stay fixed.</w:t>
       </w:r>
     </w:p>
     <w:p>

</xml_diff>